<commit_message>
Ejemplo de primer fichero HTML
</commit_message>
<xml_diff>
--- a/1er trimestre/Apuntes Git.docx
+++ b/1er trimestre/Apuntes Git.docx
@@ -108,46 +108,467 @@
     </w:p>
     <w:p/>
     <w:p>
-      <w:r>
-        <w:t xml:space="preserve">Git </w:t>
-      </w:r>
-      <w:proofErr w:type="spellStart"/>
-      <w:r>
+      <w:proofErr w:type="spellStart"/>
+      <w:r>
+        <w:rPr>
+          <w:b/>
+        </w:rPr>
+        <w:t>g</w:t>
+      </w:r>
+      <w:r>
+        <w:rPr>
+          <w:b/>
+        </w:rPr>
+        <w:t>it</w:t>
+      </w:r>
+      <w:proofErr w:type="spellEnd"/>
+      <w:r>
+        <w:rPr>
+          <w:b/>
+        </w:rPr>
+        <w:t xml:space="preserve"> </w:t>
+      </w:r>
+      <w:proofErr w:type="spellStart"/>
+      <w:r>
+        <w:rPr>
+          <w:b/>
+        </w:rPr>
         <w:t>init</w:t>
       </w:r>
       <w:proofErr w:type="spellEnd"/>
       <w:r>
-        <w:t xml:space="preserve"> transforma la carpeta en un repositorio </w:t>
+        <w:t xml:space="preserve"> transforma la carpeta en un repositorio git</w:t>
+      </w:r>
+    </w:p>
+    <w:p>
+      <w:r>
+        <w:t>No puedo hacer “</w:t>
+      </w:r>
+      <w:proofErr w:type="spellStart"/>
+      <w:r>
+        <w:t>git</w:t>
+      </w:r>
+      <w:proofErr w:type="spellEnd"/>
+      <w:r>
+        <w:t xml:space="preserve"> </w:t>
+      </w:r>
+      <w:proofErr w:type="spellStart"/>
+      <w:r>
+        <w:t>init</w:t>
+      </w:r>
+      <w:proofErr w:type="spellEnd"/>
+      <w:r>
+        <w:t xml:space="preserve">” en subcarpetas de un repositorio </w:t>
+      </w:r>
+      <w:proofErr w:type="spellStart"/>
+      <w:r>
+        <w:t>git</w:t>
+      </w:r>
+      <w:proofErr w:type="spellEnd"/>
+    </w:p>
+    <w:p/>
+    <w:p>
+      <w:proofErr w:type="spellStart"/>
+      <w:r>
+        <w:rPr>
+          <w:b/>
+        </w:rPr>
+        <w:t>git</w:t>
+      </w:r>
+      <w:proofErr w:type="spellEnd"/>
+      <w:r>
+        <w:rPr>
+          <w:b/>
+        </w:rPr>
+        <w:t xml:space="preserve"> status</w:t>
+      </w:r>
+      <w:r>
+        <w:t xml:space="preserve"> te dice el status del repo</w:t>
+      </w:r>
+    </w:p>
+    <w:p>
+      <w:pPr>
+        <w:rPr>
+          <w:b/>
+        </w:rPr>
+      </w:pPr>
+      <w:proofErr w:type="spellStart"/>
+      <w:r>
+        <w:rPr>
+          <w:b/>
+        </w:rPr>
+        <w:t>git</w:t>
+      </w:r>
+      <w:proofErr w:type="spellEnd"/>
+      <w:r>
+        <w:rPr>
+          <w:b/>
+        </w:rPr>
+        <w:t xml:space="preserve"> log</w:t>
+      </w:r>
+    </w:p>
+    <w:p>
+      <w:proofErr w:type="spellStart"/>
+      <w:r>
+        <w:rPr>
+          <w:b/>
+        </w:rPr>
+        <w:t>git</w:t>
+      </w:r>
+      <w:proofErr w:type="spellEnd"/>
+      <w:r>
+        <w:rPr>
+          <w:b/>
+        </w:rPr>
+        <w:t xml:space="preserve"> </w:t>
+      </w:r>
+      <w:proofErr w:type="spellStart"/>
+      <w:r>
+        <w:rPr>
+          <w:b/>
+        </w:rPr>
+        <w:t>add</w:t>
+      </w:r>
+      <w:proofErr w:type="spellEnd"/>
+    </w:p>
+    <w:p>
+      <w:pPr>
+        <w:tabs>
+          <w:tab w:val="left" w:pos="5940"/>
+        </w:tabs>
+      </w:pPr>
+      <w:proofErr w:type="spellStart"/>
+      <w:r>
+        <w:rPr>
+          <w:b/>
+        </w:rPr>
+        <w:t>git</w:t>
+      </w:r>
+      <w:proofErr w:type="spellEnd"/>
+      <w:r>
+        <w:rPr>
+          <w:b/>
+        </w:rPr>
+        <w:t xml:space="preserve"> </w:t>
+      </w:r>
+      <w:proofErr w:type="spellStart"/>
+      <w:r>
+        <w:rPr>
+          <w:b/>
+        </w:rPr>
+        <w:t>config</w:t>
+      </w:r>
+      <w:proofErr w:type="spellEnd"/>
+      <w:r>
+        <w:t xml:space="preserve"> –global user.name “Noel” /</w:t>
+      </w:r>
+      <w:proofErr w:type="spellStart"/>
+      <w:proofErr w:type="gramStart"/>
+      <w:r>
+        <w:t>user.email</w:t>
+      </w:r>
+      <w:proofErr w:type="spellEnd"/>
+      <w:proofErr w:type="gramEnd"/>
+      <w:r>
+        <w:t xml:space="preserve"> “correo”</w:t>
+      </w:r>
+    </w:p>
+    <w:p>
+      <w:pPr>
+        <w:tabs>
+          <w:tab w:val="left" w:pos="5940"/>
+        </w:tabs>
+      </w:pPr>
+      <w:proofErr w:type="spellStart"/>
+      <w:r>
+        <w:rPr>
+          <w:b/>
+        </w:rPr>
+        <w:t>git</w:t>
+      </w:r>
+      <w:proofErr w:type="spellEnd"/>
+      <w:r>
+        <w:rPr>
+          <w:b/>
+        </w:rPr>
+        <w:t xml:space="preserve"> </w:t>
+      </w:r>
+      <w:proofErr w:type="spellStart"/>
+      <w:r>
+        <w:rPr>
+          <w:b/>
+        </w:rPr>
+        <w:t>remote</w:t>
+      </w:r>
+      <w:proofErr w:type="spellEnd"/>
+      <w:r>
+        <w:rPr>
+          <w:b/>
+        </w:rPr>
+        <w:t xml:space="preserve"> </w:t>
+      </w:r>
+      <w:proofErr w:type="spellStart"/>
+      <w:r>
+        <w:rPr>
+          <w:b/>
+        </w:rPr>
+        <w:t>add</w:t>
+      </w:r>
+      <w:proofErr w:type="spellEnd"/>
+      <w:r>
+        <w:t xml:space="preserve"> </w:t>
+      </w:r>
+      <w:proofErr w:type="spellStart"/>
+      <w:r>
+        <w:rPr>
+          <w:b/>
+        </w:rPr>
+        <w:t>origin</w:t>
+      </w:r>
+      <w:proofErr w:type="spellEnd"/>
+      <w:r>
+        <w:rPr>
+          <w:b/>
+        </w:rPr>
+        <w:t xml:space="preserve"> https…</w:t>
+      </w:r>
+      <w:r>
+        <w:t xml:space="preserve"> para poner </w:t>
+      </w:r>
+      <w:proofErr w:type="spellStart"/>
+      <w:r>
+        <w:t>github</w:t>
+      </w:r>
+      <w:proofErr w:type="spellEnd"/>
+      <w:r>
+        <w:t xml:space="preserve"> como repositorio remoto</w:t>
+      </w:r>
+    </w:p>
+    <w:p>
+      <w:pPr>
+        <w:tabs>
+          <w:tab w:val="left" w:pos="5940"/>
+        </w:tabs>
+      </w:pPr>
+      <w:r>
+        <w:t xml:space="preserve">Hay 1 </w:t>
+      </w:r>
+      <w:proofErr w:type="spellStart"/>
+      <w:r>
+        <w:t>commit</w:t>
+      </w:r>
+      <w:proofErr w:type="spellEnd"/>
+      <w:r>
+        <w:t xml:space="preserve"> con un </w:t>
+      </w:r>
+      <w:proofErr w:type="spellStart"/>
+      <w:r>
+        <w:t>hass</w:t>
+      </w:r>
+      <w:proofErr w:type="spellEnd"/>
+      <w:r>
+        <w:t xml:space="preserve">, el head está apuntando al repositorio principal y está enganchado a </w:t>
+      </w:r>
+      <w:proofErr w:type="spellStart"/>
+      <w:r>
+        <w:t>origin</w:t>
+      </w:r>
+      <w:proofErr w:type="spellEnd"/>
+      <w:r>
+        <w:t xml:space="preserve"> que está en el mismo sitio que el </w:t>
+      </w:r>
+      <w:proofErr w:type="spellStart"/>
+      <w:r>
+        <w:t>main</w:t>
+      </w:r>
+      <w:proofErr w:type="spellEnd"/>
+      <w:r>
+        <w:t xml:space="preserve"> (</w:t>
       </w:r>
       <w:bookmarkStart w:id="0" w:name="_GoBack"/>
       <w:bookmarkEnd w:id="0"/>
-      <w:r>
+      <w:proofErr w:type="spellStart"/>
+      <w:r>
+        <w:rPr>
+          <w:b/>
+        </w:rPr>
         <w:t>git</w:t>
       </w:r>
-    </w:p>
-    <w:p>
-      <w:r>
-        <w:t>No puedo hacer “</w:t>
-      </w:r>
-      <w:proofErr w:type="spellStart"/>
-      <w:r>
+      <w:proofErr w:type="spellEnd"/>
+      <w:r>
+        <w:rPr>
+          <w:b/>
+        </w:rPr>
+        <w:t xml:space="preserve"> </w:t>
+      </w:r>
+      <w:proofErr w:type="spellStart"/>
+      <w:r>
+        <w:rPr>
+          <w:b/>
+        </w:rPr>
+        <w:t>push</w:t>
+      </w:r>
+      <w:proofErr w:type="spellEnd"/>
+      <w:r>
+        <w:rPr>
+          <w:b/>
+        </w:rPr>
+        <w:t xml:space="preserve"> -u </w:t>
+      </w:r>
+      <w:proofErr w:type="spellStart"/>
+      <w:r>
+        <w:rPr>
+          <w:b/>
+        </w:rPr>
+        <w:t>origin</w:t>
+      </w:r>
+      <w:proofErr w:type="spellEnd"/>
+      <w:r>
+        <w:rPr>
+          <w:b/>
+        </w:rPr>
+        <w:t xml:space="preserve"> </w:t>
+      </w:r>
+      <w:proofErr w:type="spellStart"/>
+      <w:r>
+        <w:rPr>
+          <w:b/>
+        </w:rPr>
+        <w:t>main</w:t>
+      </w:r>
+      <w:proofErr w:type="spellEnd"/>
+      <w:r>
+        <w:t>)</w:t>
+      </w:r>
+      <w:r>
+        <w:tab/>
+      </w:r>
+    </w:p>
+    <w:p>
+      <w:pPr>
+        <w:tabs>
+          <w:tab w:val="left" w:pos="5940"/>
+        </w:tabs>
+      </w:pPr>
+      <w:r>
+        <w:drawing>
+          <wp:inline distT="0" distB="0" distL="0" distR="0" wp14:anchorId="7AD87B8A" wp14:editId="5E085DDC">
+            <wp:extent cx="5172797" cy="962159"/>
+            <wp:effectExtent l="0" t="0" r="8890" b="9525"/>
+            <wp:docPr id="1" name="Imagen 1"/>
+            <wp:cNvGraphicFramePr>
+              <a:graphicFrameLocks xmlns:a="http://schemas.openxmlformats.org/drawingml/2006/main" noChangeAspect="1"/>
+            </wp:cNvGraphicFramePr>
+            <a:graphic xmlns:a="http://schemas.openxmlformats.org/drawingml/2006/main">
+              <a:graphicData uri="http://schemas.openxmlformats.org/drawingml/2006/picture">
+                <pic:pic xmlns:pic="http://schemas.openxmlformats.org/drawingml/2006/picture">
+                  <pic:nvPicPr>
+                    <pic:cNvPr id="1" name=""/>
+                    <pic:cNvPicPr/>
+                  </pic:nvPicPr>
+                  <pic:blipFill>
+                    <a:blip r:embed="rId4"/>
+                    <a:stretch>
+                      <a:fillRect/>
+                    </a:stretch>
+                  </pic:blipFill>
+                  <pic:spPr>
+                    <a:xfrm>
+                      <a:off x="0" y="0"/>
+                      <a:ext cx="5172797" cy="962159"/>
+                    </a:xfrm>
+                    <a:prstGeom prst="rect">
+                      <a:avLst/>
+                    </a:prstGeom>
+                  </pic:spPr>
+                </pic:pic>
+              </a:graphicData>
+            </a:graphic>
+          </wp:inline>
+        </w:drawing>
+      </w:r>
+    </w:p>
+    <w:p>
+      <w:pPr>
+        <w:tabs>
+          <w:tab w:val="left" w:pos="5940"/>
+        </w:tabs>
+      </w:pPr>
+      <w:r>
+        <w:rPr>
+          <w:b/>
+        </w:rPr>
+        <w:t xml:space="preserve">Git </w:t>
+      </w:r>
+      <w:proofErr w:type="spellStart"/>
+      <w:r>
+        <w:rPr>
+          <w:b/>
+        </w:rPr>
+        <w:t>fetch</w:t>
+      </w:r>
+      <w:proofErr w:type="spellEnd"/>
+      <w:r>
+        <w:t xml:space="preserve"> comprueba el repo remoto y mira si hay cambios</w:t>
+      </w:r>
+    </w:p>
+    <w:p>
+      <w:pPr>
+        <w:tabs>
+          <w:tab w:val="left" w:pos="5940"/>
+        </w:tabs>
+      </w:pPr>
+      <w:r>
+        <w:t xml:space="preserve">Si hay cambios hacemos un </w:t>
+      </w:r>
+      <w:proofErr w:type="spellStart"/>
+      <w:r>
+        <w:rPr>
+          <w:b/>
+        </w:rPr>
         <w:t>git</w:t>
       </w:r>
       <w:proofErr w:type="spellEnd"/>
       <w:r>
+        <w:rPr>
+          <w:b/>
+        </w:rPr>
         <w:t xml:space="preserve"> </w:t>
       </w:r>
       <w:proofErr w:type="spellStart"/>
       <w:r>
-        <w:t>init</w:t>
-      </w:r>
-      <w:proofErr w:type="spellEnd"/>
-      <w:r>
-        <w:t xml:space="preserve">” en subcarpetas de un repositorio </w:t>
-      </w:r>
-      <w:proofErr w:type="spellStart"/>
-      <w:r>
-        <w:t>git</w:t>
+        <w:rPr>
+          <w:b/>
+        </w:rPr>
+        <w:t>merge</w:t>
+      </w:r>
+      <w:proofErr w:type="spellEnd"/>
+      <w:r>
+        <w:rPr>
+          <w:b/>
+        </w:rPr>
+        <w:t xml:space="preserve"> </w:t>
+      </w:r>
+      <w:proofErr w:type="spellStart"/>
+      <w:r>
+        <w:rPr>
+          <w:b/>
+        </w:rPr>
+        <w:t>origin</w:t>
+      </w:r>
+      <w:proofErr w:type="spellEnd"/>
+      <w:r>
+        <w:rPr>
+          <w:b/>
+        </w:rPr>
+        <w:t>/</w:t>
+      </w:r>
+      <w:proofErr w:type="spellStart"/>
+      <w:r>
+        <w:rPr>
+          <w:b/>
+        </w:rPr>
+        <w:t>main</w:t>
       </w:r>
       <w:proofErr w:type="spellEnd"/>
     </w:p>

</xml_diff>

<commit_message>
Apuntes y primer ejercicio
</commit_message>
<xml_diff>
--- a/1er trimestre/Apuntes Git.docx
+++ b/1er trimestre/Apuntes Git.docx
@@ -185,26 +185,51 @@
       <w:r>
         <w:t xml:space="preserve"> te dice el status del repo</w:t>
       </w:r>
-    </w:p>
-    <w:p>
-      <w:pPr>
-        <w:rPr>
-          <w:b/>
-        </w:rPr>
-      </w:pPr>
-      <w:proofErr w:type="spellStart"/>
-      <w:r>
-        <w:rPr>
-          <w:b/>
-        </w:rPr>
+      <w:r>
+        <w:t xml:space="preserve"> (Hacer siempre que se quiera hacer algo de </w:t>
+      </w:r>
+      <w:proofErr w:type="spellStart"/>
+      <w:r>
         <w:t>git</w:t>
       </w:r>
       <w:proofErr w:type="spellEnd"/>
       <w:r>
+        <w:t>)</w:t>
+      </w:r>
+    </w:p>
+    <w:p>
+      <w:pPr>
+        <w:rPr>
+          <w:b/>
+        </w:rPr>
+      </w:pPr>
+      <w:proofErr w:type="spellStart"/>
+      <w:r>
+        <w:rPr>
+          <w:b/>
+        </w:rPr>
+        <w:t>git</w:t>
+      </w:r>
+      <w:proofErr w:type="spellEnd"/>
+      <w:r>
         <w:rPr>
           <w:b/>
         </w:rPr>
         <w:t xml:space="preserve"> log</w:t>
+      </w:r>
+      <w:r>
+        <w:rPr>
+          <w:b/>
+        </w:rPr>
+        <w:t xml:space="preserve"> </w:t>
+      </w:r>
+      <w:r>
+        <w:t>(Segundo comando a</w:t>
+      </w:r>
+      <w:bookmarkStart w:id="0" w:name="_GoBack"/>
+      <w:bookmarkEnd w:id="0"/>
+      <w:r>
+        <w:t xml:space="preserve"> hacer siempre)</w:t>
       </w:r>
     </w:p>
     <w:p>
@@ -449,6 +474,9 @@
         </w:tabs>
       </w:pPr>
       <w:r>
+        <w:rPr>
+          <w:noProof/>
+        </w:rPr>
         <w:drawing>
           <wp:inline distT="0" distB="0" distL="0" distR="0" wp14:anchorId="7AD87B8A" wp14:editId="5E085DDC">
             <wp:extent cx="5172797" cy="962159"/>
@@ -498,14 +526,12 @@
         </w:rPr>
         <w:t xml:space="preserve">Git </w:t>
       </w:r>
-      <w:proofErr w:type="spellStart"/>
-      <w:r>
-        <w:rPr>
-          <w:b/>
-        </w:rPr>
-        <w:t>code</w:t>
-      </w:r>
-      <w:proofErr w:type="spellEnd"/>
+      <w:r>
+        <w:rPr>
+          <w:b/>
+        </w:rPr>
+        <w:t>clone</w:t>
+      </w:r>
       <w:r>
         <w:t xml:space="preserve"> </w:t>
       </w:r>
@@ -695,8 +721,6 @@
       <w:r>
         <w:t>main</w:t>
       </w:r>
-      <w:bookmarkStart w:id="0" w:name="_GoBack"/>
-      <w:bookmarkEnd w:id="0"/>
       <w:proofErr w:type="spellEnd"/>
     </w:p>
     <w:sectPr>

</xml_diff>